<commit_message>
Add FCA UK Sandbox alongside CBN in fintech offer section 2
</commit_message>
<xml_diff>
--- a/kwati_current/KWATI_FULL_FINTECH_OFFER.docx
+++ b/kwati_current/KWATI_FULL_FINTECH_OFFER.docx
@@ -41,7 +41,7 @@
           <w:color w:val="B00020"/>
           <w:sz w:val="21"/>
         </w:rPr>
-        <w:t>ZerôPâŷ Money — PSSP + PTSP + Super-Agent Platform, Fintech-as-a-Service. This document shows the full ZerôPâŷ Money platform and its 18-month revenue profile not just as an equity sweetener, but as the prelude package for two things at once: the CBN Regulatory Sandbox application, and the model we intend to show future institutional investors once licensing and the Niger State pilot are underway.</w:t>
+        <w:t>ZerôPâŷ Money — PSSP + PTSP + Super-Agent Platform, Fintech-as-a-Service. This document shows the full ZerôPâŷ Money platform and its 18-month revenue profile not just as an equity sweetener, but as the prelude package for two things at once: the parallel CBN (Nigeria) and FCA (United Kingdom) Regulatory Sandbox applications, and the model we intend to show future institutional investors once licensing and the Niger State pilot are underway.</w:t>
       </w:r>
     </w:p>
     <w:p>
@@ -127,7 +127,7 @@
           <w:color w:val="B00020"/>
           <w:sz w:val="25"/>
         </w:rPr>
-        <w:t>2. CBN Regulatory Sandbox — Niger State Proof of Concept</w:t>
+        <w:t>2. Regulatory Sandbox Strategy — CBN (Nigeria) and FCA (UK), Niger State Proof of Concept</w:t>
       </w:r>
     </w:p>
     <w:p>
@@ -138,7 +138,7 @@
           <w:color w:val="000000"/>
           <w:sz w:val="21"/>
         </w:rPr>
-        <w:t>Ahead of full licensing, ZerôPâŷ Money is applying to the CBN Regulatory Sandbox to request a temporary waiver of the NGN15,000 per-transaction contactless payment limit for a closed user group in Niger State — the first zone in the rollout schedule below. This lets the technology be proven under CBN supervision before scaling to the other three zones.</w:t>
+        <w:t>Ahead of full licensing, ZerôPâŷ Money is applying to two regulatory sandboxes in parallel. In Nigeria, the CBN Regulatory Sandbox application requests a temporary waiver of the NGN15,000 per-transaction contactless payment limit for a closed user group in Niger State — the first zone in the rollout schedule below. In the United Kingdom, a parallel FCA Regulatory Sandbox application positions ZerôPâŷ Money's offline cryptographic settlement model for UK/international regulatory recognition ahead of any future cross-border or diaspora remittance corridor. Running both applications together, off the single Niger State pilot, lets the technology be proven under two separate regulatory regimes at once, before scaling to the other three zones.</w:t>
       </w:r>
     </w:p>
     <w:p>

</xml_diff>

<commit_message>
Add plain-language assumptions explainer above revenue table (Aug 13 standing rule)
</commit_message>
<xml_diff>
--- a/kwati_current/KWATI_FULL_FINTECH_OFFER.docx
+++ b/kwati_current/KWATI_FULL_FINTECH_OFFER.docx
@@ -181,6 +181,112 @@
           <w:sz w:val="21"/>
         </w:rPr>
         <w:t>GTV (Gross Transaction Value) is the total naira value moving through the terminals in a month — a volume measure, not our income. POS Fee Revenue uses the CBN's actual tiered Electronic Transfer Cap: our average transaction size (NGN45,089) falls in the NGN5,000-50,000 tier, capped at NGN10 per transaction, kept in full by ZerôPâŷ Money under its own PSSP/PTSP license. CICO Revenue is new to this model: field agents, once licensed as Super-Agents, earn a blended average of NGN150 per cash-in/cash-out transaction, based on real published agent commission schedules, assuming a conservative 15 CICO transactions per agent per day at full maturity — a planning assumption, not yet field-validated. All USD figures use NGN1,580 = $1.</w:t>
+      </w:r>
+    </w:p>
+    <w:p>
+      <w:pPr>
+        <w:spacing w:after="120" w:line="288" w:lineRule="auto"/>
+      </w:pPr>
+      <w:r>
+        <w:rPr>
+          <w:b/>
+          <w:i w:val="0"/>
+          <w:color w:val="0B1F3A"/>
+          <w:sz w:val="21"/>
+        </w:rPr>
+        <w:t>ASSUMPTIONS BEHIND THIS TABLE (plain-language explainer):</w:t>
+      </w:r>
+    </w:p>
+    <w:p>
+      <w:pPr>
+        <w:spacing w:after="120" w:line="288" w:lineRule="auto"/>
+      </w:pPr>
+      <w:r>
+        <w:rPr>
+          <w:b w:val="0"/>
+          <w:i w:val="0"/>
+          <w:sz w:val="20"/>
+        </w:rPr>
+        <w:t>Mature GTV per terminal: NGN13,500,000/month. This is the steady-state figure (month 8 onward, NGN2,430,000,000 total ÷ 180 terminals) — the ceiling each terminal ramps toward, not a starting point.</w:t>
+      </w:r>
+    </w:p>
+    <w:p>
+      <w:pPr>
+        <w:spacing w:after="120" w:line="288" w:lineRule="auto"/>
+      </w:pPr>
+      <w:r>
+        <w:rPr>
+          <w:b w:val="0"/>
+          <w:i w:val="0"/>
+          <w:sz w:val="20"/>
+        </w:rPr>
+        <w:t>Ramp curve: each zone ramps on its OWN clock from the month it goes live, not the calendar month — 20% of mature volume in its 1st live month, 40% in its 2nd, 70% in its 3rd, 100% from its 4th month onward. So month-by-month GTV in the table below is the sum of every live zone's terminals × NGN13,500,000 × that zone's own ramp %.</w:t>
+      </w:r>
+    </w:p>
+    <w:p>
+      <w:pPr>
+        <w:spacing w:after="120" w:line="288" w:lineRule="auto"/>
+      </w:pPr>
+      <w:r>
+        <w:rPr>
+          <w:b w:val="0"/>
+          <w:i w:val="0"/>
+          <w:sz w:val="20"/>
+        </w:rPr>
+        <w:t>Average transaction size: NGN45,089 — used to convert GTV into a transaction count (GTV ÷ 45,089).</w:t>
+      </w:r>
+    </w:p>
+    <w:p>
+      <w:pPr>
+        <w:spacing w:after="120" w:line="288" w:lineRule="auto"/>
+      </w:pPr>
+      <w:r>
+        <w:rPr>
+          <w:b w:val="0"/>
+          <w:i w:val="0"/>
+          <w:sz w:val="20"/>
+        </w:rPr>
+        <w:t>POS Fee Revenue formula: transaction count × NGN10/transaction, per the CBN's Electronic Transfer Cap for the NGN5,000–50,000 ticket-size tier our average transaction falls into.</w:t>
+      </w:r>
+    </w:p>
+    <w:p>
+      <w:pPr>
+        <w:spacing w:after="120" w:line="288" w:lineRule="auto"/>
+      </w:pPr>
+      <w:r>
+        <w:rPr>
+          <w:b w:val="0"/>
+          <w:i w:val="0"/>
+          <w:sz w:val="20"/>
+        </w:rPr>
+        <w:t>CICO Revenue formula: GTV × 0.5% — the Super-Agent cash-in/cash-out commission rate.</w:t>
+      </w:r>
+    </w:p>
+    <w:p>
+      <w:pPr>
+        <w:spacing w:after="120" w:line="288" w:lineRule="auto"/>
+      </w:pPr>
+      <w:r>
+        <w:rPr>
+          <w:b w:val="0"/>
+          <w:i w:val="0"/>
+          <w:sz w:val="20"/>
+        </w:rPr>
+        <w:t>Total Revenue (NGN) = POS Fee Revenue + CICO Revenue. Total Revenue (USD) = Total Revenue (NGN) ÷ 1,580 (the NGN/USD rate used throughout this document).</w:t>
+      </w:r>
+    </w:p>
+    <w:p>
+      <w:pPr>
+        <w:spacing w:after="120" w:line="288" w:lineRule="auto"/>
+      </w:pPr>
+      <w:r>
+        <w:rPr>
+          <w:b w:val="0"/>
+          <w:i/>
+          <w:color w:val="555555"/>
+          <w:sz w:val="19"/>
+        </w:rPr>
+        <w:t>Worked example, Month 4: 3 zones live (Niger 3rd month=70%, Kaduna 2nd month=40%, Benue 1st month=20%). GTV = 45×13,500,000×(0.70+0.40+0.20) = 789,750,000. Transactions = 789,750,000÷45,089 = 17,515. POS Rev = 17,515×10 = 175,154. CICO Rev = 789,750,000×0.5% = 3,948,750. Total = 4,123,904 (~$2,610).</w:t>
       </w:r>
     </w:p>
     <w:tbl>

</xml_diff>